<commit_message>
SOCO: Improv: Add a new register in Load Not on Grid Modbus table
As per request from Jio. Also, bumped the version to v2.21.
</commit_message>
<xml_diff>
--- a/Document/CustomerFacing/SOCO_Load_Status_Logic.docx
+++ b/Document/CustomerFacing/SOCO_Load_Status_Logic.docx
@@ -90,26 +90,9 @@
       <w:r>
         <w:rPr>
           <w:rFonts w:cs="Consolas" w:ascii="Consolas" w:hAnsi="Consolas"/>
-          <w:b w:val="false"/>
-          <w:bCs w:val="false"/>
           <w:sz w:val="16"/>
         </w:rPr>
         <w:t>(Input Status Register 801)</w:t>
-      </w:r>
-      <w:r>
-        <w:rPr>
-          <w:rFonts w:cs="Consolas" w:ascii="Consolas" w:hAnsi="Consolas"/>
-          <w:b/>
-          <w:bCs/>
-          <w:sz w:val="16"/>
-        </w:rPr>
-        <w:t xml:space="preserve"> </w:t>
-      </w:r>
-      <w:r>
-        <w:rPr>
-          <w:rFonts w:cs="Consolas" w:ascii="Consolas" w:hAnsi="Consolas"/>
-          <w:sz w:val="16"/>
-        </w:rPr>
         <w:br/>
         <w:t xml:space="preserve">│        └─ YES → G2  </w:t>
       </w:r>
@@ -125,17 +108,9 @@
       <w:r>
         <w:rPr>
           <w:rFonts w:cs="Consolas" w:ascii="Consolas" w:hAnsi="Consolas"/>
-          <w:b w:val="false"/>
-          <w:bCs w:val="false"/>
           <w:sz w:val="16"/>
         </w:rPr>
         <w:t>(Input Status Register 810)</w:t>
-      </w:r>
-      <w:r>
-        <w:rPr>
-          <w:rFonts w:cs="Consolas" w:ascii="Consolas" w:hAnsi="Consolas"/>
-          <w:sz w:val="16"/>
-        </w:rPr>
         <w:br/>
         <w:t xml:space="preserve">└─ NO ── </w:t>
       </w:r>
@@ -153,22 +128,7 @@
           <w:rFonts w:cs="Consolas" w:ascii="Consolas" w:hAnsi="Consolas"/>
           <w:sz w:val="16"/>
         </w:rPr>
-        <w:t xml:space="preserve">?  </w:t>
-      </w:r>
-      <w:r>
-        <w:rPr>
-          <w:rFonts w:cs="Consolas" w:ascii="Consolas" w:hAnsi="Consolas"/>
-          <w:b w:val="false"/>
-          <w:bCs w:val="false"/>
-          <w:sz w:val="16"/>
-        </w:rPr>
-        <w:t>(Input Status Register 802)</w:t>
-      </w:r>
-      <w:r>
-        <w:rPr>
-          <w:rFonts w:cs="Consolas" w:ascii="Consolas" w:hAnsi="Consolas"/>
-          <w:sz w:val="16"/>
-        </w:rPr>
+        <w:t>?  (Input Status Register 802)</w:t>
         <w:br/>
         <w:t xml:space="preserve">         ├─ YES → G3  </w:t>
       </w:r>
@@ -184,17 +144,9 @@
       <w:r>
         <w:rPr>
           <w:rFonts w:cs="Consolas" w:ascii="Consolas" w:hAnsi="Consolas"/>
-          <w:b w:val="false"/>
-          <w:bCs w:val="false"/>
           <w:sz w:val="16"/>
         </w:rPr>
         <w:t>(Input Status Register 811)</w:t>
-      </w:r>
-      <w:r>
-        <w:rPr>
-          <w:rFonts w:cs="Consolas" w:ascii="Consolas" w:hAnsi="Consolas"/>
-          <w:sz w:val="16"/>
-        </w:rPr>
         <w:br/>
         <w:t xml:space="preserve">         └─ NO ─ </w:t>
       </w:r>
@@ -212,24 +164,9 @@
           <w:rFonts w:cs="Consolas" w:ascii="Consolas" w:hAnsi="Consolas"/>
           <w:sz w:val="16"/>
         </w:rPr>
-        <w:t xml:space="preserve">?  </w:t>
-      </w:r>
-      <w:r>
-        <w:rPr>
-          <w:rFonts w:cs="Consolas" w:ascii="Consolas" w:hAnsi="Consolas"/>
-          <w:b w:val="false"/>
-          <w:bCs w:val="false"/>
-          <w:sz w:val="16"/>
-        </w:rPr>
-        <w:t>(Input Status Register 319)</w:t>
-      </w:r>
-      <w:r>
-        <w:rPr>
-          <w:rFonts w:cs="Consolas" w:ascii="Consolas" w:hAnsi="Consolas"/>
-          <w:sz w:val="16"/>
-        </w:rPr>
+        <w:t>?  (Input Status Register 319)</w:t>
         <w:br/>
-        <w:t xml:space="preserve">                 ├─ YES → G4  </w:t>
+        <w:t xml:space="preserve">                 ├─ YES ─ </w:t>
       </w:r>
       <w:r>
         <w:rPr>
@@ -238,22 +175,78 @@
           <w:bCs/>
           <w:sz w:val="16"/>
         </w:rPr>
-        <w:t xml:space="preserve">Load Not On Grid — Grid R Phase Unhealthy </w:t>
-      </w:r>
-      <w:r>
-        <w:rPr>
-          <w:rFonts w:cs="Consolas" w:ascii="Consolas" w:hAnsi="Consolas"/>
-          <w:b w:val="false"/>
-          <w:bCs w:val="false"/>
+        <w:t>Are Grid Y AND B also unhealthy</w:t>
+      </w:r>
+      <w:r>
+        <w:rPr>
+          <w:rFonts w:cs="Consolas" w:ascii="Consolas" w:hAnsi="Consolas"/>
+          <w:sz w:val="16"/>
+        </w:rPr>
+        <w:t>?  (Input Status Register 320 AND 321)</w:t>
+        <w:br/>
+        <w:t xml:space="preserve">                 │        ├─ YES → G4a  </w:t>
+      </w:r>
+      <w:r>
+        <w:rPr>
+          <w:rFonts w:cs="Consolas" w:ascii="Consolas" w:hAnsi="Consolas"/>
+          <w:b/>
+          <w:bCs/>
+          <w:sz w:val="16"/>
+        </w:rPr>
+        <w:t xml:space="preserve">Load Not On Grid — Grid R, Y &amp; B Phase Unhealthy </w:t>
+      </w:r>
+      <w:r>
+        <w:rPr>
+          <w:rFonts w:cs="Consolas" w:ascii="Consolas" w:hAnsi="Consolas"/>
+          <w:sz w:val="16"/>
+        </w:rPr>
+        <w:t>(</w:t>
+      </w:r>
+      <w:r>
+        <w:rPr>
+          <w:rFonts w:cs="Consolas" w:ascii="Consolas" w:hAnsi="Consolas"/>
+          <w:sz w:val="16"/>
+        </w:rPr>
+        <w:t>819</w:t>
+      </w:r>
+      <w:r>
+        <w:rPr>
+          <w:rFonts w:cs="Consolas" w:ascii="Consolas" w:hAnsi="Consolas"/>
+          <w:sz w:val="16"/>
+        </w:rPr>
+        <w:t>)</w:t>
+        <w:br/>
+        <w:t xml:space="preserve">                 │        └─ NO  → G4</w:t>
+      </w:r>
+      <w:r>
+        <w:rPr>
+          <w:rFonts w:cs="Consolas" w:ascii="Consolas" w:hAnsi="Consolas"/>
+          <w:sz w:val="16"/>
+        </w:rPr>
+        <w:t>b</w:t>
+      </w:r>
+      <w:r>
+        <w:rPr>
+          <w:rFonts w:cs="Consolas" w:ascii="Consolas" w:hAnsi="Consolas"/>
+          <w:sz w:val="16"/>
+        </w:rPr>
+        <w:t xml:space="preserve">  </w:t>
+      </w:r>
+      <w:r>
+        <w:rPr>
+          <w:rFonts w:cs="Consolas" w:ascii="Consolas" w:hAnsi="Consolas"/>
+          <w:b/>
+          <w:bCs/>
+          <w:sz w:val="16"/>
+        </w:rPr>
+        <w:t xml:space="preserve">Load Not On Grid — Grid R Phase Unhealthy &amp; Y or B Phase Healthy </w:t>
+      </w:r>
+      <w:r>
+        <w:rPr>
+          <w:rFonts w:cs="Consolas" w:ascii="Consolas" w:hAnsi="Consolas"/>
           <w:sz w:val="16"/>
         </w:rPr>
         <w:t>(Input Status Register 803)</w:t>
-      </w:r>
-      <w:r>
-        <w:rPr>
-          <w:rFonts w:cs="Consolas" w:ascii="Consolas" w:hAnsi="Consolas"/>
-          <w:sz w:val="16"/>
-        </w:rPr>
         <w:br/>
         <w:t xml:space="preserve">                 └─ NO ─ </w:t>
       </w:r>
@@ -273,16 +266,7 @@
         </w:rPr>
         <w:t>?  (Input Status Register 608)</w:t>
         <w:br/>
-        <w:t xml:space="preserve">                         ├─ YES → </w:t>
-      </w:r>
-      <w:r>
-        <w:rPr>
-          <w:rFonts w:cs="Consolas" w:ascii="Consolas" w:hAnsi="Consolas"/>
-          <w:b w:val="false"/>
-          <w:bCs w:val="false"/>
-          <w:sz w:val="16"/>
-        </w:rPr>
-        <w:t xml:space="preserve">G5 </w:t>
+        <w:t xml:space="preserve">                         ├─ YES → G5  </w:t>
       </w:r>
       <w:r>
         <w:rPr>
@@ -291,29 +275,14 @@
           <w:bCs/>
           <w:sz w:val="16"/>
         </w:rPr>
-        <w:t xml:space="preserve"> Load Not On Grid — Load On Solar Contactor Stuck Closed</w:t>
-      </w:r>
-      <w:r>
-        <w:rPr>
-          <w:rFonts w:cs="Consolas" w:ascii="Consolas" w:hAnsi="Consolas"/>
-          <w:sz w:val="16"/>
-        </w:rPr>
-        <w:t xml:space="preserve"> </w:t>
-      </w:r>
-      <w:r>
-        <w:rPr>
-          <w:rFonts w:cs="Consolas" w:ascii="Consolas" w:hAnsi="Consolas"/>
-          <w:b w:val="false"/>
-          <w:bCs w:val="false"/>
+        <w:t xml:space="preserve">Load Not On Grid — Load On Solar Contactor Stuck Closed </w:t>
+      </w:r>
+      <w:r>
+        <w:rPr>
+          <w:rFonts w:cs="Consolas" w:ascii="Consolas" w:hAnsi="Consolas"/>
           <w:sz w:val="16"/>
         </w:rPr>
         <w:t>(Input Status Register 804)</w:t>
-      </w:r>
-      <w:r>
-        <w:rPr>
-          <w:rFonts w:cs="Consolas" w:ascii="Consolas" w:hAnsi="Consolas"/>
-          <w:sz w:val="16"/>
-        </w:rPr>
         <w:br/>
         <w:t xml:space="preserve">                         └─ NO ─ </w:t>
       </w:r>
@@ -347,17 +316,9 @@
       <w:r>
         <w:rPr>
           <w:rFonts w:cs="Consolas" w:ascii="Consolas" w:hAnsi="Consolas"/>
-          <w:b w:val="false"/>
-          <w:bCs w:val="false"/>
           <w:sz w:val="16"/>
         </w:rPr>
         <w:t>(Input Status Register 812)</w:t>
-      </w:r>
-      <w:r>
-        <w:rPr>
-          <w:rFonts w:cs="Consolas" w:ascii="Consolas" w:hAnsi="Consolas"/>
-          <w:sz w:val="16"/>
-        </w:rPr>
         <w:br/>
         <w:t xml:space="preserve">                                 └─ NO  → G7  </w:t>
       </w:r>
@@ -373,8 +334,6 @@
       <w:r>
         <w:rPr>
           <w:rFonts w:cs="Consolas" w:ascii="Consolas" w:hAnsi="Consolas"/>
-          <w:b w:val="false"/>
-          <w:bCs w:val="false"/>
           <w:sz w:val="16"/>
         </w:rPr>
         <w:t>(Input Status Register 813)</w:t>
@@ -903,6 +862,12 @@
               </w:rPr>
               <w:t>G4</w:t>
             </w:r>
+            <w:r>
+              <w:rPr>
+                <w:sz w:val="15"/>
+              </w:rPr>
+              <w:t>b</w:t>
+            </w:r>
           </w:p>
         </w:tc>
         <w:tc>
@@ -927,7 +892,7 @@
               <w:rPr>
                 <w:sz w:val="15"/>
               </w:rPr>
-              <w:t>Load Not On Grid — Grid R Phase Unhealthy</w:t>
+              <w:t>Load Not On Grid — Grid R Phase Unhealthy &amp; Y or B Phase Healthy</w:t>
             </w:r>
           </w:p>
         </w:tc>
@@ -953,7 +918,7 @@
               <w:rPr>
                 <w:sz w:val="15"/>
               </w:rPr>
-              <w:t>NOT (K5 ON) AND NOT (Disable Load On Grid &gt; 0) AND (Grid R Phase Unhealthy)</w:t>
+              <w:t>NOT (K5 ON) AND NOT (Disable Load On Grid &gt; 0) AND (Grid R Phase Unhealthy) AND NOT (Grid Y Phase Unhealthy AND Grid B Phase Unhealthy)</w:t>
             </w:r>
           </w:p>
         </w:tc>
@@ -980,6 +945,115 @@
                 <w:sz w:val="15"/>
               </w:rPr>
               <w:t>803</w:t>
+            </w:r>
+          </w:p>
+        </w:tc>
+      </w:tr>
+      <w:tr>
+        <w:trPr>
+          <w:trHeight w:val="149" w:hRule="atLeast"/>
+        </w:trPr>
+        <w:tc>
+          <w:tcPr>
+            <w:tcW w:w="698" w:type="dxa"/>
+            <w:tcBorders>
+              <w:top w:val="single" w:sz="4" w:space="0" w:color="BBBBBB"/>
+              <w:left w:val="single" w:sz="4" w:space="0" w:color="BBBBBB"/>
+              <w:bottom w:val="single" w:sz="4" w:space="0" w:color="BBBBBB"/>
+              <w:right w:val="single" w:sz="4" w:space="0" w:color="BBBBBB"/>
+            </w:tcBorders>
+          </w:tcPr>
+          <w:p>
+            <w:pPr>
+              <w:pStyle w:val="Normal"/>
+              <w:bidi w:val="0"/>
+              <w:spacing w:before="0" w:after="0"/>
+              <w:jc w:val="left"/>
+              <w:rPr/>
+            </w:pPr>
+            <w:r>
+              <w:rPr>
+                <w:sz w:val="15"/>
+              </w:rPr>
+              <w:t>G4a</w:t>
+            </w:r>
+          </w:p>
+        </w:tc>
+        <w:tc>
+          <w:tcPr>
+            <w:tcW w:w="5201" w:type="dxa"/>
+            <w:tcBorders>
+              <w:top w:val="single" w:sz="4" w:space="0" w:color="BBBBBB"/>
+              <w:left w:val="single" w:sz="4" w:space="0" w:color="BBBBBB"/>
+              <w:bottom w:val="single" w:sz="4" w:space="0" w:color="BBBBBB"/>
+              <w:right w:val="single" w:sz="4" w:space="0" w:color="BBBBBB"/>
+            </w:tcBorders>
+          </w:tcPr>
+          <w:p>
+            <w:pPr>
+              <w:pStyle w:val="Normal"/>
+              <w:bidi w:val="0"/>
+              <w:spacing w:before="0" w:after="0"/>
+              <w:jc w:val="left"/>
+              <w:rPr/>
+            </w:pPr>
+            <w:r>
+              <w:rPr>
+                <w:sz w:val="15"/>
+              </w:rPr>
+              <w:t>Load Not On Grid — Grid R, Y &amp; B Phase Unhealthy</w:t>
+            </w:r>
+          </w:p>
+        </w:tc>
+        <w:tc>
+          <w:tcPr>
+            <w:tcW w:w="7301" w:type="dxa"/>
+            <w:tcBorders>
+              <w:top w:val="single" w:sz="4" w:space="0" w:color="BBBBBB"/>
+              <w:left w:val="single" w:sz="4" w:space="0" w:color="BBBBBB"/>
+              <w:bottom w:val="single" w:sz="4" w:space="0" w:color="BBBBBB"/>
+              <w:right w:val="single" w:sz="4" w:space="0" w:color="BBBBBB"/>
+            </w:tcBorders>
+          </w:tcPr>
+          <w:p>
+            <w:pPr>
+              <w:pStyle w:val="Normal"/>
+              <w:bidi w:val="0"/>
+              <w:spacing w:before="0" w:after="0"/>
+              <w:jc w:val="left"/>
+              <w:rPr/>
+            </w:pPr>
+            <w:r>
+              <w:rPr>
+                <w:sz w:val="15"/>
+              </w:rPr>
+              <w:t>NOT (K5 ON) AND NOT (Disable Load On Grid &gt; 0) AND (Grid R Phase Unhealthy) AND (Grid Y Phase Unhealthy) AND (Grid B Phase Unhealthy)</w:t>
+            </w:r>
+          </w:p>
+        </w:tc>
+        <w:tc>
+          <w:tcPr>
+            <w:tcW w:w="1199" w:type="dxa"/>
+            <w:tcBorders>
+              <w:top w:val="single" w:sz="4" w:space="0" w:color="BBBBBB"/>
+              <w:left w:val="single" w:sz="4" w:space="0" w:color="BBBBBB"/>
+              <w:bottom w:val="single" w:sz="4" w:space="0" w:color="BBBBBB"/>
+              <w:right w:val="single" w:sz="4" w:space="0" w:color="BBBBBB"/>
+            </w:tcBorders>
+          </w:tcPr>
+          <w:p>
+            <w:pPr>
+              <w:pStyle w:val="Normal"/>
+              <w:bidi w:val="0"/>
+              <w:spacing w:before="0" w:after="0"/>
+              <w:jc w:val="left"/>
+              <w:rPr/>
+            </w:pPr>
+            <w:r>
+              <w:rPr>
+                <w:sz w:val="15"/>
+              </w:rPr>
+              <w:t>819</w:t>
             </w:r>
           </w:p>
         </w:tc>

</xml_diff>